<commit_message>
Update example reference outputs
</commit_message>
<xml_diff>
--- a/exemple/Exemplu_Contract.docx
+++ b/exemple/Exemplu_Contract.docx
@@ -79,6 +79,7 @@
       </w:r>
     </w:p>
     <w:sectPr>
+      <w:footerReference w:type="default" r:id="rId7"/>
       <w:pgSz w:w="11906" w:h="16838" w:orient="portrait"/>
       <w:pgMar w:top="1137" w:right="849" w:bottom="1137" w:left="1411" w:header="708" w:footer="708" w:gutter="0"/>
       <w:pgNumType/>
@@ -127,6 +128,28 @@
     </w:p>
   </w:endnote>
 </w:endnotes>
+</file>
+
+<file path=word/footer1.xml><?xml version="1.0" encoding="utf-8"?>
+<w:ftr xmlns:wpc="http://schemas.microsoft.com/office/word/2010/wordprocessingCanvas" xmlns:mc="http://schemas.openxmlformats.org/markup-compatibility/2006" xmlns:o="urn:schemas-microsoft-com:office:office" xmlns:r="http://schemas.openxmlformats.org/officeDocument/2006/relationships" xmlns:m="http://schemas.openxmlformats.org/officeDocument/2006/math" xmlns:v="urn:schemas-microsoft-com:vml" xmlns:wp14="http://schemas.microsoft.com/office/word/2010/wordprocessingDrawing" xmlns:wp="http://schemas.openxmlformats.org/drawingml/2006/wordprocessingDrawing" xmlns:w10="urn:schemas-microsoft-com:office:word" xmlns:w="http://schemas.openxmlformats.org/wordprocessingml/2006/main" xmlns:w14="http://schemas.microsoft.com/office/word/2010/wordml" xmlns:w15="http://schemas.microsoft.com/office/word/2012/wordml" xmlns:wpg="http://schemas.microsoft.com/office/word/2010/wordprocessingGroup" xmlns:wpi="http://schemas.microsoft.com/office/word/2010/wordprocessingInk" xmlns:wne="http://schemas.microsoft.com/office/word/2006/wordml" xmlns:wps="http://schemas.microsoft.com/office/word/2010/wordprocessingShape">
+  <w:p>
+    <w:pPr>
+      <w:jc w:val="center"/>
+    </w:pPr>
+    <w:r>
+      <w:t xml:space="preserve">- </w:t>
+    </w:r>
+    <w:r>
+      <w:fldChar w:fldCharType="begin"/>
+      <w:instrText xml:space="preserve">PAGE</w:instrText>
+      <w:fldChar w:fldCharType="separate"/>
+      <w:fldChar w:fldCharType="end"/>
+    </w:r>
+    <w:r>
+      <w:t xml:space="preserve"> -</w:t>
+    </w:r>
+  </w:p>
+</w:ftr>
 </file>
 
 <file path=word/footnotes.xml><?xml version="1.0" encoding="utf-8"?>

</xml_diff>